<commit_message>
Expand the how-to guide with CV and blog-post steps
</commit_message>
<xml_diff>
--- a/templates/How to update your website.docx
+++ b/templates/How to update your website.docx
@@ -15,7 +15,7 @@
         <w:spacing w:after="140"/>
       </w:pPr>
       <w:r>
-        <w:t xml:space="preserve">Your website (aj-jang.github.io) is built from simple text files, but you never have to edit them directly. Here is the easy way to keep it current.</w:t>
+        <w:t xml:space="preserve">Your website (aj-jang.github.io) is built from simple text files, but you never have to edit them directly. This guide covers the everyday updates: refreshing your CV, adding a blog post, and changing a page.</w:t>
       </w:r>
     </w:p>
     <w:p>
@@ -28,6 +28,14 @@
     </w:p>
     <w:p>
       <w:pPr>
+        <w:spacing w:after="140"/>
+      </w:pPr>
+      <w:r>
+        <w:t xml:space="preserve">Most updates follow the same steps:</w:t>
+      </w:r>
+    </w:p>
+    <w:p>
+      <w:pPr>
         <w:pStyle w:val="ListParagraph"/>
         <w:numPr>
           <w:ilvl w:val="0"/>
@@ -62,7 +70,7 @@
         <w:spacing w:after="80"/>
       </w:pPr>
       <w:r>
-        <w:t xml:space="preserve">Tell Claude what to do, for example: "publish this as a blog post" or "apply this page update."</w:t>
+        <w:t xml:space="preserve">Tell Claude what to do, for example "publish this as a blog post" or "update my CV."</w:t>
       </w:r>
     </w:p>
     <w:p>
@@ -75,7 +83,7 @@
         <w:spacing w:after="80"/>
       </w:pPr>
       <w:r>
-        <w:t xml:space="preserve">Claude converts the file, updates the site, and shows you a preview.</w:t>
+        <w:t xml:space="preserve">Claude converts your file and updates the site's files for you.</w:t>
       </w:r>
     </w:p>
     <w:p>
@@ -88,7 +96,7 @@
         <w:spacing w:after="80"/>
       </w:pPr>
       <w:r>
-        <w:t xml:space="preserve">Once you approve, Claude publishes to GitHub and the live site updates within a minute or two.</w:t>
+        <w:t xml:space="preserve">You publish the change by pushing to GitHub (see "Publishing your changes" below). The live site updates within a minute or two.</w:t>
       </w:r>
     </w:p>
     <w:p>
@@ -96,15 +104,173 @@
         <w:pStyle w:val="Heading2"/>
       </w:pPr>
       <w:r>
+        <w:t xml:space="preserve">Updating your CV</w:t>
+      </w:r>
+    </w:p>
+    <w:p>
+      <w:pPr>
+        <w:spacing w:after="140"/>
+      </w:pPr>
+      <w:r>
+        <w:t xml:space="preserve">Your CV is available on your home page through the "Download my CV" link. That link always points to one file with a fixed name: Alice-Jang-CV.pdf. Because the name never changes, updating your CV is simple — you just replace that file.</w:t>
+      </w:r>
+    </w:p>
+    <w:p>
+      <w:pPr>
+        <w:spacing w:after="80" w:before="80"/>
+      </w:pPr>
+      <w:r>
+        <w:rPr>
+          <w:b/>
+          <w:bCs/>
+        </w:rPr>
+        <w:t xml:space="preserve">Option 1 — ask Claude.  </w:t>
+      </w:r>
+      <w:r>
+        <w:t xml:space="preserve">Save your new CV anywhere in your website folder, then tell Claude "update my CV." Claude replaces the file for you. This is the easiest option.</w:t>
+      </w:r>
+    </w:p>
+    <w:p>
+      <w:pPr>
+        <w:spacing w:after="80" w:before="80"/>
+      </w:pPr>
+      <w:r>
+        <w:rPr>
+          <w:b/>
+          <w:bCs/>
+        </w:rPr>
+        <w:t xml:space="preserve">Option 2 — do it yourself.</w:t>
+      </w:r>
+      <w:r>
+        <w:t xml:space="preserve"/>
+      </w:r>
+    </w:p>
+    <w:p>
+      <w:pPr>
+        <w:pStyle w:val="ListParagraph"/>
+        <w:numPr>
+          <w:ilvl w:val="0"/>
+          <w:numId w:val="3"/>
+        </w:numPr>
+        <w:spacing w:after="80"/>
+      </w:pPr>
+      <w:r>
+        <w:t xml:space="preserve">Rename your new CV file to exactly: Alice-Jang-CV.pdf</w:t>
+      </w:r>
+    </w:p>
+    <w:p>
+      <w:pPr>
+        <w:pStyle w:val="ListParagraph"/>
+        <w:numPr>
+          <w:ilvl w:val="0"/>
+          <w:numId w:val="3"/>
+        </w:numPr>
+        <w:spacing w:after="80"/>
+      </w:pPr>
+      <w:r>
+        <w:t xml:space="preserve">Move it into the folder aj-jang.github.io\assets\cv\, replacing the old file of the same name.</w:t>
+      </w:r>
+    </w:p>
+    <w:p>
+      <w:pPr>
+        <w:pStyle w:val="ListParagraph"/>
+        <w:numPr>
+          <w:ilvl w:val="0"/>
+          <w:numId w:val="3"/>
+        </w:numPr>
+        <w:spacing w:after="80"/>
+      </w:pPr>
+      <w:r>
+        <w:t xml:space="preserve">Publish the change (see "Publishing your changes" below).</w:t>
+      </w:r>
+    </w:p>
+    <w:p>
+      <w:pPr>
+        <w:spacing w:after="140"/>
+      </w:pPr>
+      <w:r>
+        <w:t xml:space="preserve">Either way, the download link on your site stays the same, so it always works.</w:t>
+      </w:r>
+    </w:p>
+    <w:p>
+      <w:pPr>
+        <w:pStyle w:val="Heading2"/>
+      </w:pPr>
+      <w:r>
         <w:t xml:space="preserve">Adding a blog post</w:t>
       </w:r>
     </w:p>
     <w:p>
       <w:pPr>
-        <w:spacing w:after="140"/>
-      </w:pPr>
-      <w:r>
-        <w:t xml:space="preserve">Use "Blog post template.docx." Every post needs a title, a date, a category, and tags. Claude handles the formatting and publishing.</w:t>
+        <w:pStyle w:val="ListParagraph"/>
+        <w:numPr>
+          <w:ilvl w:val="0"/>
+          <w:numId w:val="4"/>
+        </w:numPr>
+        <w:spacing w:after="80"/>
+      </w:pPr>
+      <w:r>
+        <w:t xml:space="preserve">Make a copy of "Blog post template.docx." Do not type in the template itself — keep it blank so you can reuse it. Rename the copy to something memorable, such as the post title.</w:t>
+      </w:r>
+    </w:p>
+    <w:p>
+      <w:pPr>
+        <w:pStyle w:val="ListParagraph"/>
+        <w:numPr>
+          <w:ilvl w:val="0"/>
+          <w:numId w:val="4"/>
+        </w:numPr>
+        <w:spacing w:after="80"/>
+      </w:pPr>
+      <w:r>
+        <w:t xml:space="preserve">In the copy, fill in the four fields: Title, Date, Category, and Tags.</w:t>
+      </w:r>
+    </w:p>
+    <w:p>
+      <w:pPr>
+        <w:pStyle w:val="ListParagraph"/>
+        <w:numPr>
+          <w:ilvl w:val="0"/>
+          <w:numId w:val="4"/>
+        </w:numPr>
+        <w:spacing w:after="80"/>
+      </w:pPr>
+      <w:r>
+        <w:t xml:space="preserve">Write your post under "Post body." Normal Word formatting works.</w:t>
+      </w:r>
+    </w:p>
+    <w:p>
+      <w:pPr>
+        <w:pStyle w:val="ListParagraph"/>
+        <w:numPr>
+          <w:ilvl w:val="0"/>
+          <w:numId w:val="4"/>
+        </w:numPr>
+        <w:spacing w:after="80"/>
+      </w:pPr>
+      <w:r>
+        <w:t xml:space="preserve">Save the file, then tell Claude "publish this as a blog post."</w:t>
+      </w:r>
+    </w:p>
+    <w:p>
+      <w:pPr>
+        <w:pStyle w:val="ListParagraph"/>
+        <w:numPr>
+          <w:ilvl w:val="0"/>
+          <w:numId w:val="4"/>
+        </w:numPr>
+        <w:spacing w:after="80"/>
+      </w:pPr>
+      <w:r>
+        <w:t xml:space="preserve">Claude turns it into a post and adds it to your site. You then publish the change (see "Publishing your changes" below).</w:t>
+      </w:r>
+    </w:p>
+    <w:p>
+      <w:pPr>
+        <w:spacing w:after="140"/>
+      </w:pPr>
+      <w:r>
+        <w:t xml:space="preserve">Once published, the post appears on your Blog page, and any tags you used appear on your Tags page.</w:t>
       </w:r>
     </w:p>
     <w:p>
@@ -136,7 +302,7 @@
         <w:spacing w:after="140"/>
       </w:pPr>
       <w:r>
-        <w:t xml:space="preserve">Tip: reuse a small, consistent set of tags so your Tags page stays meaningful rather than sprawling. A good starting set: human-ai, collective-intelligence, information-diffusion, online-communities, experiments, teaching, conferences, research-notes.</w:t>
+        <w:t xml:space="preserve">There is no separate step to create a tag — you simply type it in the Tags field of your post, and it appears on the Tags page automatically. Tip: reuse a small, consistent set of tags so the page stays meaningful. A good starting set: human-ai, collective-intelligence, information-diffusion, online-communities, experiments, teaching, conferences, research-notes.</w:t>
       </w:r>
     </w:p>
     <w:p>
@@ -152,7 +318,7 @@
         <w:spacing w:after="140"/>
       </w:pPr>
       <w:r>
-        <w:t xml:space="preserve">Use "Page update template.docx" to change the Research, Teaching, Presentations, Awards &amp; Service, or Home pages.</w:t>
+        <w:t xml:space="preserve">To change an existing page — Research, Teaching, Presentations, Awards &amp; Service, or Home — use "Page update template.docx." Fill it in, save it, and tell Claude "apply this page update."</w:t>
       </w:r>
     </w:p>
     <w:p>
@@ -160,6 +326,56 @@
         <w:pStyle w:val="Heading2"/>
       </w:pPr>
       <w:r>
+        <w:t xml:space="preserve">Publishing your changes</w:t>
+      </w:r>
+    </w:p>
+    <w:p>
+      <w:pPr>
+        <w:spacing w:after="140"/>
+      </w:pPr>
+      <w:r>
+        <w:t xml:space="preserve">After Claude updates your site's files, the changes are saved on your computer but not yet live. To publish them, you "push" them to GitHub. Open PowerShell and run these two lines:</w:t>
+      </w:r>
+    </w:p>
+    <w:p>
+      <w:pPr>
+        <w:spacing w:after="40"/>
+      </w:pPr>
+      <w:r>
+        <w:rPr>
+          <w:rFonts w:ascii="Courier New" w:cs="Courier New" w:eastAsia="Courier New" w:hAnsi="Courier New"/>
+          <w:sz w:val="20"/>
+          <w:szCs w:val="20"/>
+        </w:rPr>
+        <w:t xml:space="preserve">cd "D:\Dropbox\aj-jang.github.io"</w:t>
+      </w:r>
+    </w:p>
+    <w:p>
+      <w:pPr>
+        <w:spacing w:after="40"/>
+      </w:pPr>
+      <w:r>
+        <w:rPr>
+          <w:rFonts w:ascii="Courier New" w:cs="Courier New" w:eastAsia="Courier New" w:hAnsi="Courier New"/>
+          <w:sz w:val="20"/>
+          <w:szCs w:val="20"/>
+        </w:rPr>
+        <w:t xml:space="preserve">git push origin main</w:t>
+      </w:r>
+    </w:p>
+    <w:p>
+      <w:pPr>
+        <w:spacing w:after="140"/>
+      </w:pPr>
+      <w:r>
+        <w:t xml:space="preserve">GitHub then rebuilds your site automatically. After a minute or two, your changes are live at https://aj-jang.github.io. If you use GitHub Desktop instead, just open it and click "Push origin."</w:t>
+      </w:r>
+    </w:p>
+    <w:p>
+      <w:pPr>
+        <w:pStyle w:val="Heading2"/>
+      </w:pPr>
+      <w:r>
         <w:t xml:space="preserve">Your site's pages</w:t>
       </w:r>
     </w:p>
@@ -168,7 +384,7 @@
         <w:pStyle w:val="ListParagraph"/>
         <w:numPr>
           <w:ilvl w:val="0"/>
-          <w:numId w:val="3"/>
+          <w:numId w:val="5"/>
         </w:numPr>
         <w:spacing w:after="60"/>
       </w:pPr>
@@ -181,7 +397,7 @@
         <w:pStyle w:val="ListParagraph"/>
         <w:numPr>
           <w:ilvl w:val="0"/>
-          <w:numId w:val="3"/>
+          <w:numId w:val="5"/>
         </w:numPr>
         <w:spacing w:after="60"/>
       </w:pPr>
@@ -194,7 +410,7 @@
         <w:pStyle w:val="ListParagraph"/>
         <w:numPr>
           <w:ilvl w:val="0"/>
-          <w:numId w:val="3"/>
+          <w:numId w:val="5"/>
         </w:numPr>
         <w:spacing w:after="60"/>
       </w:pPr>
@@ -207,7 +423,7 @@
         <w:pStyle w:val="ListParagraph"/>
         <w:numPr>
           <w:ilvl w:val="0"/>
-          <w:numId w:val="3"/>
+          <w:numId w:val="5"/>
         </w:numPr>
         <w:spacing w:after="60"/>
       </w:pPr>
@@ -220,7 +436,7 @@
         <w:pStyle w:val="ListParagraph"/>
         <w:numPr>
           <w:ilvl w:val="0"/>
-          <w:numId w:val="3"/>
+          <w:numId w:val="5"/>
         </w:numPr>
         <w:spacing w:after="60"/>
       </w:pPr>
@@ -233,7 +449,7 @@
         <w:pStyle w:val="ListParagraph"/>
         <w:numPr>
           <w:ilvl w:val="0"/>
-          <w:numId w:val="3"/>
+          <w:numId w:val="5"/>
         </w:numPr>
         <w:spacing w:after="60"/>
       </w:pPr>
@@ -246,7 +462,7 @@
         <w:pStyle w:val="ListParagraph"/>
         <w:numPr>
           <w:ilvl w:val="0"/>
-          <w:numId w:val="3"/>
+          <w:numId w:val="5"/>
         </w:numPr>
         <w:spacing w:after="60"/>
       </w:pPr>
@@ -452,6 +668,30 @@
       </w:pPr>
     </w:lvl>
   </w:abstractNum>
+  <w:abstractNum w:abstractNumId="4" w15:restartNumberingAfterBreak="0">
+    <w:multiLevelType w:val="hybridMultilevel"/>
+    <w:lvl w:ilvl="0" w15:tentative="1">
+      <w:start w:val="1"/>
+      <w:numFmt w:val="decimal"/>
+      <w:lvlText w:val="%1."/>
+      <w:lvlJc w:val="left"/>
+      <w:pPr>
+        <w:ind w:left="540" w:hanging="280"/>
+      </w:pPr>
+    </w:lvl>
+  </w:abstractNum>
+  <w:abstractNum w:abstractNumId="5" w15:restartNumberingAfterBreak="0">
+    <w:multiLevelType w:val="hybridMultilevel"/>
+    <w:lvl w:ilvl="0" w15:tentative="1">
+      <w:start w:val="1"/>
+      <w:numFmt w:val="decimal"/>
+      <w:lvlText w:val="%1."/>
+      <w:lvlJc w:val="left"/>
+      <w:pPr>
+        <w:ind w:left="540" w:hanging="280"/>
+      </w:pPr>
+    </w:lvl>
+  </w:abstractNum>
   <w:num w:numId="1">
     <w:abstractNumId w:val="1"/>
     <w:lvlOverride w:ilvl="0">
@@ -465,6 +705,18 @@
     </w:lvlOverride>
   </w:num>
   <w:num w:numId="3">
+    <w:abstractNumId w:val="4"/>
+    <w:lvlOverride w:ilvl="0">
+      <w:startOverride w:val="1"/>
+    </w:lvlOverride>
+  </w:num>
+  <w:num w:numId="4">
+    <w:abstractNumId w:val="5"/>
+    <w:lvlOverride w:ilvl="0">
+      <w:startOverride w:val="1"/>
+    </w:lvlOverride>
+  </w:num>
+  <w:num w:numId="5">
     <w:abstractNumId w:val="2"/>
     <w:lvlOverride w:ilvl="0">
       <w:startOverride w:val="1"/>
@@ -680,7 +932,7 @@
     <w:next w:val="Normal"/>
     <w:qFormat/>
     <w:pPr>
-      <w:spacing w:after="140" w:before="320"/>
+      <w:spacing w:after="140" w:before="340"/>
       <w:outlineLvl w:val="1"/>
     </w:pPr>
     <w:rPr>

</xml_diff>

<commit_message>
Clarify publishing steps in the how-to guide
</commit_message>
<xml_diff>
--- a/templates/How to update your website.docx
+++ b/templates/How to update your website.docx
@@ -96,7 +96,7 @@
         <w:spacing w:after="80"/>
       </w:pPr>
       <w:r>
-        <w:t xml:space="preserve">You publish the change by pushing to GitHub (see "Publishing your changes" below). The live site updates within a minute or two.</w:t>
+        <w:t xml:space="preserve">You publish the change by committing and pushing it to GitHub (see "Publishing your changes" below). The live site updates within a minute or two.</w:t>
       </w:r>
     </w:p>
     <w:p>
@@ -127,7 +127,7 @@
         <w:t xml:space="preserve">Option 1 — ask Claude.  </w:t>
       </w:r>
       <w:r>
-        <w:t xml:space="preserve">Save your new CV anywhere in your website folder, then tell Claude "update my CV." Claude replaces the file for you. This is the easiest option.</w:t>
+        <w:t xml:space="preserve">Save your new CV anywhere in your website folder (or upload it to Claude directly), then tell Claude "update my CV." Claude replaces the file and commits it for you. This is the easiest option.</w:t>
       </w:r>
     </w:p>
     <w:p>
@@ -181,15 +181,7 @@
         <w:spacing w:after="80"/>
       </w:pPr>
       <w:r>
-        <w:t xml:space="preserve">Publish the change (see "Publishing your changes" below).</w:t>
-      </w:r>
-    </w:p>
-    <w:p>
-      <w:pPr>
-        <w:spacing w:after="140"/>
-      </w:pPr>
-      <w:r>
-        <w:t xml:space="preserve">Either way, the download link on your site stays the same, so it always works.</w:t>
+        <w:t xml:space="preserve">Publish the change with all four commands in "Publishing your changes" below — replacing the file alone does not update the website.</w:t>
       </w:r>
     </w:p>
     <w:p>
@@ -397,7 +389,15 @@
         <w:spacing w:after="140"/>
       </w:pPr>
       <w:r>
-        <w:t xml:space="preserve">After Claude updates your site's files, the changes are saved on your computer but not yet live. To publish them, you "push" them to GitHub. Open PowerShell and run these two lines:</w:t>
+        <w:t xml:space="preserve">Your changes only go live after they are saved into the project's history and sent to GitHub. This is the step that is easy to miss: editing or replacing a file on your computer changes nothing on the website by itself.</w:t>
+      </w:r>
+    </w:p>
+    <w:p>
+      <w:pPr>
+        <w:spacing w:after="140"/>
+      </w:pPr>
+      <w:r>
+        <w:t xml:space="preserve">To publish, open PowerShell and run these four lines, one at a time:</w:t>
       </w:r>
     </w:p>
     <w:p>
@@ -423,6 +423,32 @@
           <w:sz w:val="20"/>
           <w:szCs w:val="20"/>
         </w:rPr>
+        <w:t xml:space="preserve">git add .</w:t>
+      </w:r>
+    </w:p>
+    <w:p>
+      <w:pPr>
+        <w:spacing w:after="40"/>
+      </w:pPr>
+      <w:r>
+        <w:rPr>
+          <w:rFonts w:ascii="Courier New" w:cs="Courier New" w:eastAsia="Courier New" w:hAnsi="Courier New"/>
+          <w:sz w:val="20"/>
+          <w:szCs w:val="20"/>
+        </w:rPr>
+        <w:t xml:space="preserve">git commit -m "Describe what you changed"</w:t>
+      </w:r>
+    </w:p>
+    <w:p>
+      <w:pPr>
+        <w:spacing w:after="40"/>
+      </w:pPr>
+      <w:r>
+        <w:rPr>
+          <w:rFonts w:ascii="Courier New" w:cs="Courier New" w:eastAsia="Courier New" w:hAnsi="Courier New"/>
+          <w:sz w:val="20"/>
+          <w:szCs w:val="20"/>
+        </w:rPr>
         <w:t xml:space="preserve">git push origin main</w:t>
       </w:r>
     </w:p>
@@ -431,7 +457,31 @@
         <w:spacing w:after="140"/>
       </w:pPr>
       <w:r>
-        <w:t xml:space="preserve">GitHub then rebuilds your site automatically. After a minute or two, your changes are live at https://aj-jang.github.io. If you use GitHub Desktop instead, just open it and click "Push origin."</w:t>
+        <w:t xml:space="preserve">What the lines do: the first moves into your website folder; "git add" and "git commit" save your change into the project's history; "git push" sends it to GitHub.</w:t>
+      </w:r>
+    </w:p>
+    <w:p>
+      <w:pPr>
+        <w:spacing w:after="140"/>
+      </w:pPr>
+      <w:r>
+        <w:t xml:space="preserve">If the commit line says "nothing to commit, working tree clean," that is not an error — it simply means Claude already saved the change for you. Just continue to the last line.</w:t>
+      </w:r>
+    </w:p>
+    <w:p>
+      <w:pPr>
+        <w:spacing w:after="140"/>
+      </w:pPr>
+      <w:r>
+        <w:t xml:space="preserve">After you push, GitHub rebuilds your site automatically and your changes are live within a minute or two. If you use GitHub Desktop instead, it shows your changed files — type a short summary, click Commit, then click Push origin.</w:t>
+      </w:r>
+    </w:p>
+    <w:p>
+      <w:pPr>
+        <w:spacing w:after="140"/>
+      </w:pPr>
+      <w:r>
+        <w:t xml:space="preserve">If a change you made never shows up on the website, it almost always means it was not committed and pushed. Run the four lines above and it will go through.</w:t>
       </w:r>
     </w:p>
     <w:p>

</xml_diff>